<commit_message>
chore: include template and project file updates
</commit_message>
<xml_diff>
--- a/Resources/EnvelopeTemplate.docx
+++ b/Resources/EnvelopeTemplate.docx
@@ -10,14 +10,14 @@
         </w:tabs>
         <w:ind w:right="-691"/>
         <w:rPr>
-          <w:rFonts w:cs="Cordia New"/>
+          <w:rFonts w:ascii="TH SarabunPSK" w:hAnsi="TH SarabunPSK" w:cs="TH SarabunPSK"/>
           <w:sz w:val="32"/>
           <w:szCs w:val="32"/>
         </w:rPr>
       </w:pPr>
       <w:r>
         <w:rPr>
-          <w:rFonts w:cs="Cordia New"/>
+          <w:rFonts w:ascii="TH SarabunPSK" w:hAnsi="TH SarabunPSK" w:cs="TH SarabunPSK" w:hint="cs"/>
           <w:sz w:val="32"/>
           <w:szCs w:val="32"/>
         </w:rPr>
@@ -32,14 +32,14 @@
         </w:tabs>
         <w:ind w:right="-691"/>
         <w:rPr>
-          <w:rFonts w:cs="Cordia New"/>
+          <w:rFonts w:ascii="TH SarabunPSK" w:hAnsi="TH SarabunPSK" w:cs="TH SarabunPSK"/>
           <w:sz w:val="32"/>
           <w:szCs w:val="32"/>
         </w:rPr>
       </w:pPr>
       <w:r>
         <w:rPr>
-          <w:rFonts w:cs="Cordia New"/>
+          <w:rFonts w:ascii="TH SarabunPSK" w:hAnsi="TH SarabunPSK" w:cs="TH SarabunPSK" w:hint="cs"/>
           <w:sz w:val="32"/>
           <w:szCs w:val="32"/>
         </w:rPr>
@@ -54,7 +54,7 @@
         </w:tabs>
         <w:ind w:right="-691"/>
         <w:rPr>
-          <w:rFonts w:cs="Cordia New"/>
+          <w:rFonts w:ascii="TH SarabunPSK" w:hAnsi="TH SarabunPSK" w:cs="TH SarabunPSK"/>
           <w:sz w:val="32"/>
           <w:szCs w:val="32"/>
         </w:rPr>
@@ -68,7 +68,7 @@
         </w:tabs>
         <w:ind w:right="-691"/>
         <w:rPr>
-          <w:rFonts w:cs="Cordia New"/>
+          <w:rFonts w:ascii="TH SarabunPSK" w:hAnsi="TH SarabunPSK" w:cs="TH SarabunPSK"/>
           <w:sz w:val="32"/>
           <w:szCs w:val="32"/>
         </w:rPr>
@@ -77,90 +77,22 @@
     <w:p>
       <w:pPr>
         <w:tabs>
-          <w:tab w:val="left" w:pos="4320"/>
-          <w:tab w:val="left" w:pos="10500"/>
-        </w:tabs>
-        <w:ind w:right="-691"/>
+          <w:tab w:val="left" w:pos="4253"/>
+          <w:tab w:val="left" w:pos="7797"/>
+        </w:tabs>
+        <w:ind w:left="3969" w:right="3752"/>
         <w:rPr>
-          <w:rFonts w:cs="Cordia New"/>
+          <w:rFonts w:ascii="TH SarabunPSK" w:hAnsi="TH SarabunPSK" w:cs="TH SarabunPSK"/>
           <w:sz w:val="32"/>
           <w:szCs w:val="32"/>
+          <w:u w:val="single"/>
         </w:rPr>
       </w:pPr>
-    </w:p>
-    <w:p>
-      <w:pPr>
-        <w:tabs>
-          <w:tab w:val="left" w:pos="4320"/>
-          <w:tab w:val="left" w:pos="10500"/>
-        </w:tabs>
-        <w:ind w:right="-691"/>
+      <w:r>
         <w:rPr>
-          <w:rFonts w:cs="Cordia New"/>
+          <w:rFonts w:ascii="TH SarabunPSK" w:hAnsi="TH SarabunPSK" w:cs="TH SarabunPSK" w:hint="cs"/>
           <w:sz w:val="32"/>
           <w:szCs w:val="32"/>
-          <w:cs/>
-        </w:rPr>
-      </w:pPr>
-    </w:p>
-    <w:p>
-      <w:pPr>
-        <w:tabs>
-          <w:tab w:val="left" w:pos="4320"/>
-          <w:tab w:val="left" w:pos="10500"/>
-        </w:tabs>
-        <w:ind w:right="-691"/>
-        <w:rPr>
-          <w:rFonts w:cs="Cordia New"/>
-          <w:sz w:val="32"/>
-          <w:szCs w:val="32"/>
-        </w:rPr>
-      </w:pPr>
-    </w:p>
-    <w:p>
-      <w:pPr>
-        <w:tabs>
-          <w:tab w:val="left" w:pos="4320"/>
-          <w:tab w:val="left" w:pos="10500"/>
-        </w:tabs>
-        <w:ind w:right="-691"/>
-        <w:rPr>
-          <w:rFonts w:cs="Cordia New"/>
-          <w:sz w:val="32"/>
-          <w:szCs w:val="32"/>
-        </w:rPr>
-      </w:pPr>
-      <w:r>
-        <w:rPr>
-          <w:rFonts w:cs="Cordia New"/>
-          <w:sz w:val="32"/>
-          <w:szCs w:val="32"/>
-        </w:rPr>
-        <w:t xml:space="preserve">   </w:t>
-      </w:r>
-    </w:p>
-    <w:p>
-      <w:pPr>
-        <w:tabs>
-          <w:tab w:val="left" w:pos="4253"/>
-          <w:tab w:val="left" w:pos="7797"/>
-        </w:tabs>
-        <w:ind w:left="3969" w:right="3752"/>
-        <w:rPr>
-          <w:szCs w:val="30"/>
-          <w:u w:val="single"/>
-        </w:rPr>
-      </w:pPr>
-      <w:r>
-        <w:rPr>
-          <w:rFonts w:cs="Times New Roman"/>
-          <w:szCs w:val="24"/>
-        </w:rPr>
-        <w:t xml:space="preserve"> </w:t>
-      </w:r>
-      <w:r>
-        <w:rPr>
-          <w:szCs w:val="30"/>
         </w:rPr>
         <w:t>{{address}}</w:t>
       </w:r>
@@ -168,126 +100,10 @@
     <w:p>
       <w:pPr>
         <w:tabs>
-          <w:tab w:val="left" w:pos="720"/>
-          <w:tab w:val="left" w:pos="1440"/>
-          <w:tab w:val="left" w:pos="2160"/>
-          <w:tab w:val="left" w:pos="2880"/>
-          <w:tab w:val="left" w:pos="3600"/>
-          <w:tab w:val="left" w:pos="4320"/>
-          <w:tab w:val="left" w:pos="5040"/>
-          <w:tab w:val="left" w:pos="5760"/>
-          <w:tab w:val="left" w:pos="6480"/>
-          <w:tab w:val="left" w:pos="7200"/>
-          <w:tab w:val="left" w:pos="7920"/>
-          <w:tab w:val="left" w:pos="8640"/>
-          <w:tab w:val="left" w:pos="9360"/>
-          <w:tab w:val="left" w:pos="10080"/>
-          <w:tab w:val="left" w:pos="10800"/>
-        </w:tabs>
-        <w:ind w:left="3969" w:right="3752"/>
+          <w:tab w:val="left" w:pos="3237"/>
+        </w:tabs>
         <w:rPr>
-          <w:rFonts w:cs="Cordia New"/>
-          <w:szCs w:val="24"/>
-        </w:rPr>
-      </w:pPr>
-    </w:p>
-    <w:p>
-      <w:pPr>
-        <w:tabs>
-          <w:tab w:val="left" w:pos="720"/>
-          <w:tab w:val="left" w:pos="1440"/>
-          <w:tab w:val="left" w:pos="2160"/>
-          <w:tab w:val="left" w:pos="2880"/>
-          <w:tab w:val="left" w:pos="3600"/>
-          <w:tab w:val="left" w:pos="4320"/>
-          <w:tab w:val="left" w:pos="5040"/>
-          <w:tab w:val="left" w:pos="5760"/>
-          <w:tab w:val="left" w:pos="6480"/>
-          <w:tab w:val="left" w:pos="7200"/>
-          <w:tab w:val="left" w:pos="7920"/>
-          <w:tab w:val="left" w:pos="8640"/>
-          <w:tab w:val="left" w:pos="9360"/>
-          <w:tab w:val="left" w:pos="10080"/>
-          <w:tab w:val="left" w:pos="10800"/>
-        </w:tabs>
-        <w:ind w:left="3969" w:right="3752"/>
-        <w:rPr>
-          <w:rFonts w:cs="Cordia New"/>
-          <w:szCs w:val="24"/>
-        </w:rPr>
-      </w:pPr>
-    </w:p>
-    <w:p>
-      <w:pPr>
-        <w:tabs>
-          <w:tab w:val="left" w:pos="720"/>
-          <w:tab w:val="left" w:pos="1440"/>
-          <w:tab w:val="left" w:pos="2160"/>
-          <w:tab w:val="left" w:pos="2880"/>
-          <w:tab w:val="left" w:pos="3600"/>
-          <w:tab w:val="left" w:pos="4320"/>
-          <w:tab w:val="left" w:pos="5040"/>
-          <w:tab w:val="left" w:pos="5760"/>
-          <w:tab w:val="left" w:pos="6480"/>
-          <w:tab w:val="left" w:pos="7200"/>
-          <w:tab w:val="left" w:pos="7920"/>
-          <w:tab w:val="left" w:pos="8640"/>
-          <w:tab w:val="left" w:pos="9360"/>
-          <w:tab w:val="left" w:pos="10080"/>
-          <w:tab w:val="left" w:pos="10800"/>
-        </w:tabs>
-        <w:ind w:left="3969" w:right="3752"/>
-        <w:rPr>
-          <w:rFonts w:cs="Cordia New"/>
-          <w:szCs w:val="24"/>
-        </w:rPr>
-      </w:pPr>
-    </w:p>
-    <w:p>
-      <w:pPr>
-        <w:tabs>
-          <w:tab w:val="left" w:pos="720"/>
-          <w:tab w:val="left" w:pos="1440"/>
-          <w:tab w:val="left" w:pos="2160"/>
-          <w:tab w:val="left" w:pos="2880"/>
-          <w:tab w:val="left" w:pos="3600"/>
-          <w:tab w:val="left" w:pos="4320"/>
-          <w:tab w:val="left" w:pos="5040"/>
-          <w:tab w:val="left" w:pos="5760"/>
-          <w:tab w:val="left" w:pos="6480"/>
-          <w:tab w:val="left" w:pos="7200"/>
-          <w:tab w:val="left" w:pos="7920"/>
-          <w:tab w:val="left" w:pos="8640"/>
-          <w:tab w:val="left" w:pos="9360"/>
-          <w:tab w:val="left" w:pos="10080"/>
-          <w:tab w:val="left" w:pos="10800"/>
-        </w:tabs>
-        <w:ind w:left="3969" w:right="3752"/>
-        <w:rPr>
-          <w:rFonts w:cs="Cordia New"/>
-          <w:szCs w:val="24"/>
-        </w:rPr>
-      </w:pPr>
-    </w:p>
-    <w:p>
-      <w:pPr>
-        <w:tabs>
-          <w:tab w:val="left" w:pos="3237"/>
-        </w:tabs>
-        <w:ind w:left="3969" w:right="3752"/>
-        <w:rPr>
-          <w:rFonts w:cs="Times New Roman"/>
-          <w:szCs w:val="24"/>
-        </w:rPr>
-      </w:pPr>
-    </w:p>
-    <w:p>
-      <w:pPr>
-        <w:tabs>
-          <w:tab w:val="left" w:pos="3237"/>
-        </w:tabs>
-        <w:rPr>
-          <w:rFonts w:cs="Times New Roman"/>
+          <w:rFonts w:ascii="TH SarabunPSK" w:hAnsi="TH SarabunPSK" w:cs="TH SarabunPSK"/>
           <w:szCs w:val="24"/>
         </w:rPr>
       </w:pPr>
@@ -299,13 +115,16 @@
         <w:tblLook w:val="04A0" w:firstRow="1" w:lastRow="0" w:firstColumn="1" w:lastColumn="0" w:noHBand="0" w:noVBand="1"/>
       </w:tblPr>
       <w:tblGrid>
-        <w:gridCol w:w="5292"/>
-        <w:gridCol w:w="360"/>
+        <w:gridCol w:w="5404"/>
+        <w:gridCol w:w="367"/>
       </w:tblGrid>
       <w:tr>
+        <w:trPr>
+          <w:trHeight w:val="1013"/>
+        </w:trPr>
         <w:tc>
           <w:tcPr>
-            <w:tcW w:w="5292" w:type="dxa"/>
+            <w:tcW w:w="5404" w:type="dxa"/>
           </w:tcPr>
           <w:p>
             <w:pPr>
@@ -328,39 +147,48 @@
               </w:tabs>
               <w:ind w:right="-691"/>
               <w:rPr>
-                <w:rFonts w:cs="Cordia New"/>
+                <w:rFonts w:ascii="TH SarabunPSK" w:hAnsi="TH SarabunPSK" w:cs="TH SarabunPSK"/>
                 <w:szCs w:val="24"/>
-                <w:cs/>
               </w:rPr>
             </w:pPr>
-            <w:proofErr w:type="gramStart"/>
+          </w:p>
+          <w:p>
+            <w:pPr>
+              <w:tabs>
+                <w:tab w:val="left" w:pos="720"/>
+                <w:tab w:val="left" w:pos="1440"/>
+                <w:tab w:val="left" w:pos="2160"/>
+                <w:tab w:val="left" w:pos="2880"/>
+                <w:tab w:val="left" w:pos="3600"/>
+                <w:tab w:val="left" w:pos="4320"/>
+                <w:tab w:val="left" w:pos="5040"/>
+                <w:tab w:val="left" w:pos="5760"/>
+                <w:tab w:val="left" w:pos="6480"/>
+                <w:tab w:val="left" w:pos="7200"/>
+                <w:tab w:val="left" w:pos="7920"/>
+                <w:tab w:val="left" w:pos="8640"/>
+                <w:tab w:val="left" w:pos="9360"/>
+                <w:tab w:val="left" w:pos="10080"/>
+                <w:tab w:val="left" w:pos="10800"/>
+              </w:tabs>
+              <w:ind w:right="-691"/>
+              <w:rPr>
+                <w:rFonts w:ascii="TH SarabunPSK" w:hAnsi="TH SarabunPSK" w:cs="TH SarabunPSK"/>
+                <w:szCs w:val="24"/>
+              </w:rPr>
+            </w:pPr>
             <w:r>
               <w:rPr>
-                <w:rFonts w:cs="Cordia New"/>
+                <w:rFonts w:ascii="TH SarabunPSK" w:hAnsi="TH SarabunPSK" w:cs="TH SarabunPSK" w:hint="cs"/>
                 <w:szCs w:val="24"/>
               </w:rPr>
-              <w:t xml:space="preserve">Admission : </w:t>
-            </w:r>
-            <w:r>
-              <w:rPr>
-                <w:rFonts w:cs="Cordia New"/>
-                <w:szCs w:val="24"/>
-              </w:rPr>
-              <w:t>{{</w:t>
-            </w:r>
-            <w:proofErr w:type="gramEnd"/>
-            <w:r>
-              <w:rPr>
-                <w:rFonts w:cs="Cordia New"/>
-                <w:szCs w:val="24"/>
-              </w:rPr>
-              <w:t>id}}</w:t>
+              <w:t>{{documents}}</w:t>
             </w:r>
           </w:p>
         </w:tc>
         <w:tc>
           <w:tcPr>
-            <w:tcW w:w="360" w:type="dxa"/>
+            <w:tcW w:w="367" w:type="dxa"/>
           </w:tcPr>
           <w:p>
             <w:pPr>
@@ -383,7 +211,7 @@
               </w:tabs>
               <w:ind w:right="-691"/>
               <w:rPr>
-                <w:rFonts w:cs="Cordia New"/>
+                <w:rFonts w:ascii="TH SarabunPSK" w:hAnsi="TH SarabunPSK" w:cs="TH SarabunPSK"/>
                 <w:szCs w:val="24"/>
               </w:rPr>
             </w:pPr>
@@ -391,9 +219,12 @@
         </w:tc>
       </w:tr>
       <w:tr>
+        <w:trPr>
+          <w:trHeight w:val="411"/>
+        </w:trPr>
         <w:tc>
           <w:tcPr>
-            <w:tcW w:w="5292" w:type="dxa"/>
+            <w:tcW w:w="5404" w:type="dxa"/>
           </w:tcPr>
           <w:p>
             <w:pPr>
@@ -416,22 +247,16 @@
               </w:tabs>
               <w:ind w:right="-691"/>
               <w:rPr>
-                <w:rFonts w:cs="Cordia New"/>
+                <w:rFonts w:ascii="TH SarabunPSK" w:hAnsi="TH SarabunPSK" w:cs="TH SarabunPSK"/>
                 <w:szCs w:val="24"/>
+                <w:cs/>
               </w:rPr>
             </w:pPr>
-            <w:r>
-              <w:rPr>
-                <w:rFonts w:cs="Cordia New"/>
-                <w:szCs w:val="24"/>
-              </w:rPr>
-              <w:t>{{documents}}</w:t>
-            </w:r>
           </w:p>
         </w:tc>
         <w:tc>
           <w:tcPr>
-            <w:tcW w:w="360" w:type="dxa"/>
+            <w:tcW w:w="367" w:type="dxa"/>
           </w:tcPr>
           <w:p>
             <w:pPr>
@@ -454,7 +279,7 @@
               </w:tabs>
               <w:ind w:right="-691"/>
               <w:rPr>
-                <w:rFonts w:cs="Cordia New"/>
+                <w:rFonts w:ascii="TH SarabunPSK" w:hAnsi="TH SarabunPSK" w:cs="TH SarabunPSK"/>
                 <w:szCs w:val="24"/>
               </w:rPr>
             </w:pPr>
@@ -462,14 +287,17 @@
         </w:tc>
       </w:tr>
       <w:tr>
+        <w:trPr>
+          <w:trHeight w:val="396"/>
+        </w:trPr>
         <w:tc>
           <w:tcPr>
-            <w:tcW w:w="5292" w:type="dxa"/>
+            <w:tcW w:w="5404" w:type="dxa"/>
           </w:tcPr>
           <w:p>
             <w:pPr>
               <w:rPr>
-                <w:rFonts w:cs="Cordia New"/>
+                <w:rFonts w:ascii="TH SarabunPSK" w:hAnsi="TH SarabunPSK" w:cs="TH SarabunPSK"/>
                 <w:szCs w:val="24"/>
               </w:rPr>
             </w:pPr>
@@ -477,7 +305,7 @@
         </w:tc>
         <w:tc>
           <w:tcPr>
-            <w:tcW w:w="360" w:type="dxa"/>
+            <w:tcW w:w="367" w:type="dxa"/>
           </w:tcPr>
           <w:p>
             <w:pPr>
@@ -500,8 +328,9 @@
               </w:tabs>
               <w:ind w:right="-691"/>
               <w:rPr>
-                <w:rFonts w:cs="Cordia New"/>
+                <w:rFonts w:ascii="TH SarabunPSK" w:hAnsi="TH SarabunPSK" w:cs="TH SarabunPSK"/>
                 <w:szCs w:val="24"/>
+                <w:cs/>
               </w:rPr>
             </w:pPr>
           </w:p>
@@ -509,16 +338,16 @@
       </w:tr>
       <w:tr>
         <w:trPr>
-          <w:trHeight w:val="261"/>
+          <w:trHeight w:val="319"/>
         </w:trPr>
         <w:tc>
           <w:tcPr>
-            <w:tcW w:w="5292" w:type="dxa"/>
+            <w:tcW w:w="5404" w:type="dxa"/>
           </w:tcPr>
           <w:p>
             <w:pPr>
               <w:rPr>
-                <w:rFonts w:cs="Cordia New"/>
+                <w:rFonts w:ascii="TH SarabunPSK" w:hAnsi="TH SarabunPSK" w:cs="TH SarabunPSK"/>
                 <w:szCs w:val="24"/>
               </w:rPr>
             </w:pPr>
@@ -526,7 +355,7 @@
         </w:tc>
         <w:tc>
           <w:tcPr>
-            <w:tcW w:w="360" w:type="dxa"/>
+            <w:tcW w:w="367" w:type="dxa"/>
           </w:tcPr>
           <w:p>
             <w:pPr>
@@ -549,7 +378,7 @@
               </w:tabs>
               <w:ind w:right="-691"/>
               <w:rPr>
-                <w:rFonts w:cs="Cordia New"/>
+                <w:rFonts w:ascii="TH SarabunPSK" w:hAnsi="TH SarabunPSK" w:cs="TH SarabunPSK"/>
                 <w:szCs w:val="24"/>
               </w:rPr>
             </w:pPr>
@@ -558,22 +387,22 @@
       </w:tr>
       <w:tr>
         <w:trPr>
-          <w:trHeight w:val="124"/>
+          <w:trHeight w:val="151"/>
         </w:trPr>
         <w:tc>
           <w:tcPr>
-            <w:tcW w:w="5292" w:type="dxa"/>
+            <w:tcW w:w="5404" w:type="dxa"/>
           </w:tcPr>
           <w:p>
             <w:pPr>
               <w:rPr>
-                <w:rFonts w:cs="Cordia New"/>
+                <w:rFonts w:ascii="TH SarabunPSK" w:hAnsi="TH SarabunPSK" w:cs="TH SarabunPSK"/>
                 <w:szCs w:val="24"/>
               </w:rPr>
             </w:pPr>
             <w:r>
               <w:rPr>
-                <w:rFonts w:cs="Cordia New"/>
+                <w:rFonts w:ascii="TH SarabunPSK" w:hAnsi="TH SarabunPSK" w:cs="TH SarabunPSK" w:hint="cs"/>
                 <w:szCs w:val="24"/>
               </w:rPr>
               <w:t xml:space="preserve"> </w:t>
@@ -582,7 +411,7 @@
         </w:tc>
         <w:tc>
           <w:tcPr>
-            <w:tcW w:w="360" w:type="dxa"/>
+            <w:tcW w:w="367" w:type="dxa"/>
           </w:tcPr>
           <w:p>
             <w:pPr>
@@ -605,7 +434,7 @@
               </w:tabs>
               <w:ind w:right="-691"/>
               <w:rPr>
-                <w:rFonts w:cs="Cordia New"/>
+                <w:rFonts w:ascii="TH SarabunPSK" w:hAnsi="TH SarabunPSK" w:cs="TH SarabunPSK"/>
                 <w:szCs w:val="24"/>
                 <w:cs/>
               </w:rPr>
@@ -622,7 +451,7 @@
         </w:tabs>
         <w:ind w:right="-691"/>
         <w:rPr>
-          <w:rFonts w:cs="Cordia New"/>
+          <w:rFonts w:ascii="TH SarabunPSK" w:hAnsi="TH SarabunPSK" w:cs="TH SarabunPSK"/>
           <w:sz w:val="32"/>
           <w:szCs w:val="32"/>
         </w:rPr>
@@ -636,7 +465,7 @@
         </w:tabs>
         <w:ind w:right="-691"/>
         <w:rPr>
-          <w:rFonts w:cs="Cordia New"/>
+          <w:rFonts w:ascii="TH SarabunPSK" w:hAnsi="TH SarabunPSK" w:cs="TH SarabunPSK"/>
           <w:sz w:val="32"/>
           <w:szCs w:val="32"/>
         </w:rPr>
@@ -650,7 +479,7 @@
         </w:tabs>
         <w:ind w:right="-691"/>
         <w:rPr>
-          <w:rFonts w:cs="Cordia New"/>
+          <w:rFonts w:ascii="TH SarabunPSK" w:hAnsi="TH SarabunPSK" w:cs="TH SarabunPSK"/>
           <w:sz w:val="32"/>
           <w:szCs w:val="32"/>
         </w:rPr>
@@ -664,7 +493,7 @@
         </w:tabs>
         <w:ind w:right="-691"/>
         <w:rPr>
-          <w:rFonts w:cs="Cordia New"/>
+          <w:rFonts w:ascii="TH SarabunPSK" w:hAnsi="TH SarabunPSK" w:cs="TH SarabunPSK"/>
           <w:sz w:val="32"/>
           <w:szCs w:val="32"/>
         </w:rPr>
@@ -678,7 +507,49 @@
         </w:tabs>
         <w:ind w:right="-691"/>
         <w:rPr>
-          <w:rFonts w:cs="Cordia New"/>
+          <w:rFonts w:ascii="TH SarabunPSK" w:hAnsi="TH SarabunPSK" w:cs="TH SarabunPSK"/>
+          <w:sz w:val="32"/>
+          <w:szCs w:val="32"/>
+        </w:rPr>
+      </w:pPr>
+    </w:p>
+    <w:p>
+      <w:pPr>
+        <w:tabs>
+          <w:tab w:val="left" w:pos="4320"/>
+          <w:tab w:val="left" w:pos="10500"/>
+        </w:tabs>
+        <w:ind w:right="-691"/>
+        <w:rPr>
+          <w:rFonts w:ascii="TH SarabunPSK" w:hAnsi="TH SarabunPSK" w:cs="TH SarabunPSK"/>
+          <w:sz w:val="32"/>
+          <w:szCs w:val="32"/>
+        </w:rPr>
+      </w:pPr>
+    </w:p>
+    <w:p>
+      <w:pPr>
+        <w:tabs>
+          <w:tab w:val="left" w:pos="4320"/>
+          <w:tab w:val="left" w:pos="10500"/>
+        </w:tabs>
+        <w:ind w:right="-691"/>
+        <w:rPr>
+          <w:rFonts w:ascii="TH SarabunPSK" w:hAnsi="TH SarabunPSK" w:cs="TH SarabunPSK"/>
+          <w:sz w:val="32"/>
+          <w:szCs w:val="32"/>
+        </w:rPr>
+      </w:pPr>
+    </w:p>
+    <w:p>
+      <w:pPr>
+        <w:tabs>
+          <w:tab w:val="left" w:pos="4320"/>
+          <w:tab w:val="left" w:pos="10500"/>
+        </w:tabs>
+        <w:ind w:right="-691"/>
+        <w:rPr>
+          <w:rFonts w:ascii="TH SarabunPSK" w:hAnsi="TH SarabunPSK" w:cs="TH SarabunPSK"/>
           <w:szCs w:val="24"/>
           <w:cs/>
         </w:rPr>

</xml_diff>

<commit_message>
chore: sync project and template files
</commit_message>
<xml_diff>
--- a/Resources/EnvelopeTemplate.docx
+++ b/Resources/EnvelopeTemplate.docx
@@ -115,16 +115,16 @@
         <w:tblLook w:val="04A0" w:firstRow="1" w:lastRow="0" w:firstColumn="1" w:lastColumn="0" w:noHBand="0" w:noVBand="1"/>
       </w:tblPr>
       <w:tblGrid>
-        <w:gridCol w:w="5404"/>
-        <w:gridCol w:w="367"/>
+        <w:gridCol w:w="4142"/>
+        <w:gridCol w:w="280"/>
       </w:tblGrid>
       <w:tr>
         <w:trPr>
-          <w:trHeight w:val="1013"/>
+          <w:trHeight w:val="1157"/>
         </w:trPr>
         <w:tc>
           <w:tcPr>
-            <w:tcW w:w="5404" w:type="dxa"/>
+            <w:tcW w:w="4142" w:type="dxa"/>
           </w:tcPr>
           <w:p>
             <w:pPr>
@@ -188,7 +188,7 @@
         </w:tc>
         <w:tc>
           <w:tcPr>
-            <w:tcW w:w="367" w:type="dxa"/>
+            <w:tcW w:w="280" w:type="dxa"/>
           </w:tcPr>
           <w:p>
             <w:pPr>
@@ -220,11 +220,11 @@
       </w:tr>
       <w:tr>
         <w:trPr>
-          <w:trHeight w:val="411"/>
+          <w:trHeight w:val="469"/>
         </w:trPr>
         <w:tc>
           <w:tcPr>
-            <w:tcW w:w="5404" w:type="dxa"/>
+            <w:tcW w:w="4142" w:type="dxa"/>
           </w:tcPr>
           <w:p>
             <w:pPr>
@@ -256,7 +256,7 @@
         </w:tc>
         <w:tc>
           <w:tcPr>
-            <w:tcW w:w="367" w:type="dxa"/>
+            <w:tcW w:w="280" w:type="dxa"/>
           </w:tcPr>
           <w:p>
             <w:pPr>
@@ -288,11 +288,11 @@
       </w:tr>
       <w:tr>
         <w:trPr>
-          <w:trHeight w:val="396"/>
+          <w:trHeight w:val="451"/>
         </w:trPr>
         <w:tc>
           <w:tcPr>
-            <w:tcW w:w="5404" w:type="dxa"/>
+            <w:tcW w:w="4142" w:type="dxa"/>
           </w:tcPr>
           <w:p>
             <w:pPr>
@@ -305,7 +305,7 @@
         </w:tc>
         <w:tc>
           <w:tcPr>
-            <w:tcW w:w="367" w:type="dxa"/>
+            <w:tcW w:w="280" w:type="dxa"/>
           </w:tcPr>
           <w:p>
             <w:pPr>
@@ -338,11 +338,11 @@
       </w:tr>
       <w:tr>
         <w:trPr>
-          <w:trHeight w:val="319"/>
+          <w:trHeight w:val="364"/>
         </w:trPr>
         <w:tc>
           <w:tcPr>
-            <w:tcW w:w="5404" w:type="dxa"/>
+            <w:tcW w:w="4142" w:type="dxa"/>
           </w:tcPr>
           <w:p>
             <w:pPr>
@@ -355,7 +355,7 @@
         </w:tc>
         <w:tc>
           <w:tcPr>
-            <w:tcW w:w="367" w:type="dxa"/>
+            <w:tcW w:w="280" w:type="dxa"/>
           </w:tcPr>
           <w:p>
             <w:pPr>
@@ -387,11 +387,11 @@
       </w:tr>
       <w:tr>
         <w:trPr>
-          <w:trHeight w:val="151"/>
+          <w:trHeight w:val="171"/>
         </w:trPr>
         <w:tc>
           <w:tcPr>
-            <w:tcW w:w="5404" w:type="dxa"/>
+            <w:tcW w:w="4142" w:type="dxa"/>
           </w:tcPr>
           <w:p>
             <w:pPr>
@@ -411,7 +411,7 @@
         </w:tc>
         <w:tc>
           <w:tcPr>
-            <w:tcW w:w="367" w:type="dxa"/>
+            <w:tcW w:w="280" w:type="dxa"/>
           </w:tcPr>
           <w:p>
             <w:pPr>

</xml_diff>